<commit_message>
Update documentation and configuration for IP access control and Docker setup
- Renamed docker-compose.yml to docker-compose.example.yaml and updated README instructions accordingly.
- Changed default port mapping from 4000:3000 to 8073:8073 in Docker configuration.
- Enhanced IP access control documentation, clarifying trusted proxies and their configuration.
- Added detailed explanations regarding the handling of client IP addresses behind proxies.
- Updated migration notes to clarify idempotency and tracking of applied migrations.
- Added tests for IP address resolution and forwarding header handling in the ipAccess module.
</commit_message>
<xml_diff>
--- a/doc/02-architecture.docx
+++ b/doc/02-architecture.docx
@@ -3486,7 +3486,7 @@
         <w:t xml:space="preserve"> </w:t>
       </w:r>
       <w:r>
-        <w:t xml:space="preserve">— if the whole-app IP allowlist is on and this socket</w:t>
+        <w:t xml:space="preserve">— if the whole-app IP allowlist is on and this client</w:t>
       </w:r>
       <w:r>
         <w:t xml:space="preserve"> </w:t>
@@ -4260,25 +4260,7 @@
         <w:t xml:space="preserve"> </w:t>
       </w:r>
       <w:r>
-        <w:t xml:space="preserve">is enabled, but nothing in the current deployment</w:t>
-      </w:r>
-      <w:r>
-        <w:t xml:space="preserve"> </w:t>
-      </w:r>
-      <w:r>
-        <w:t xml:space="preserve">overwrites</w:t>
-      </w:r>
-      <w:r>
-        <w:t xml:space="preserve"> </w:t>
-      </w:r>
-      <w:r>
-        <w:rPr>
-          <w:rStyle w:val="VerbatimChar"/>
-        </w:rPr>
-        <w:t xml:space="preserve">X-Forwarded-For</w:t>
-      </w:r>
-      <w:r>
-        <w:t xml:space="preserve">, so</w:t>
+        <w:t xml:space="preserve">is enabled, so</w:t>
       </w:r>
       <w:r>
         <w:t xml:space="preserve"> </w:t>
@@ -4293,13 +4275,25 @@
         <w:t xml:space="preserve"> </w:t>
       </w:r>
       <w:r>
-        <w:t xml:space="preserve">is client-controlled. That is exactly</w:t>
-      </w:r>
-      <w:r>
-        <w:t xml:space="preserve"> </w:t>
-      </w:r>
-      <w:r>
-        <w:t xml:space="preserve">why the allowlist compares the</w:t>
+        <w:t xml:space="preserve">(which the rate limits use)</w:t>
+      </w:r>
+      <w:r>
+        <w:t xml:space="preserve"> </w:t>
+      </w:r>
+      <w:r>
+        <w:t xml:space="preserve">is whatever the last hop forwarded. Nothing in front of the container has to</w:t>
+      </w:r>
+      <w:r>
+        <w:t xml:space="preserve"> </w:t>
+      </w:r>
+      <w:r>
+        <w:t xml:space="preserve">overwrite that header, so a visitor can put anything in it — which is why the IP</w:t>
+      </w:r>
+      <w:r>
+        <w:t xml:space="preserve"> </w:t>
+      </w:r>
+      <w:r>
+        <w:t xml:space="preserve">allowlist does</w:t>
       </w:r>
       <w:r>
         <w:t xml:space="preserve"> </w:t>
@@ -4309,13 +4303,13 @@
           <w:b/>
           <w:bCs/>
         </w:rPr>
-        <w:t xml:space="preserve">TCP socket</w:t>
-      </w:r>
-      <w:r>
-        <w:t xml:space="preserve"> </w:t>
-      </w:r>
-      <w:r>
-        <w:t xml:space="preserve">address instead of</w:t>
+        <w:t xml:space="preserve">not</w:t>
+      </w:r>
+      <w:r>
+        <w:t xml:space="preserve"> </w:t>
+      </w:r>
+      <w:r>
+        <w:t xml:space="preserve">use</w:t>
       </w:r>
       <w:r>
         <w:t xml:space="preserve"> </w:t>
@@ -4325,6 +4319,48 @@
           <w:rStyle w:val="VerbatimChar"/>
         </w:rPr>
         <w:t xml:space="preserve">req.ip</w:t>
+      </w:r>
+      <w:r>
+        <w:t xml:space="preserve">. It resolves the address itself: the TCP</w:t>
+      </w:r>
+      <w:r>
+        <w:t xml:space="preserve"> </w:t>
+      </w:r>
+      <w:r>
+        <w:t xml:space="preserve">socket address by default, or — when</w:t>
+      </w:r>
+      <w:r>
+        <w:t xml:space="preserve"> </w:t>
+      </w:r>
+      <w:r>
+        <w:rPr>
+          <w:rStyle w:val="VerbatimChar"/>
+        </w:rPr>
+        <w:t xml:space="preserve">IP_ACCESS_TRUSTED_PROXIES</w:t>
+      </w:r>
+      <w:r>
+        <w:t xml:space="preserve"> </w:t>
+      </w:r>
+      <w:r>
+        <w:t xml:space="preserve">lists the proxy</w:t>
+      </w:r>
+      <w:r>
+        <w:t xml:space="preserve"> </w:t>
+      </w:r>
+      <w:r>
+        <w:t xml:space="preserve">in front of us — the right-most forwarded address that is not itself a listed</w:t>
+      </w:r>
+      <w:r>
+        <w:t xml:space="preserve"> </w:t>
+      </w:r>
+      <w:r>
+        <w:t xml:space="preserve">proxy. See the backend guide,</w:t>
+      </w:r>
+      <w:r>
+        <w:t xml:space="preserve"> </w:t>
+      </w:r>
+      <w:r>
+        <w:t xml:space="preserve">“IP allowlist internals”</w:t>
       </w:r>
       <w:r>
         <w:t xml:space="preserve">.</w:t>
@@ -5981,130 +6017,30 @@
               <w:rPr>
                 <w:rStyle w:val="VerbatimChar"/>
               </w:rPr>
-              <w:t xml:space="preserve">README.md</w:t>
-            </w:r>
-            <w:r>
-              <w:t xml:space="preserve"> </w:t>
-            </w:r>
-            <w:r>
-              <w:t xml:space="preserve">says port</w:t>
-            </w:r>
-            <w:r>
-              <w:t xml:space="preserve"> </w:t>
-            </w:r>
-            <w:r>
-              <w:rPr>
-                <w:rStyle w:val="VerbatimChar"/>
-              </w:rPr>
-              <w:t xml:space="preserve">3000</w:t>
-            </w:r>
-            <w:r>
-              <w:t xml:space="preserve"> </w:t>
-            </w:r>
-            <w:r>
-              <w:t xml:space="preserve">with mapping</w:t>
-            </w:r>
-            <w:r>
-              <w:t xml:space="preserve"> </w:t>
-            </w:r>
-            <w:r>
-              <w:rPr>
-                <w:rStyle w:val="VerbatimChar"/>
-              </w:rPr>
-              <w:t xml:space="preserve">4000:3000</w:t>
-            </w:r>
-            <w:r>
-              <w:t xml:space="preserve">, health at</w:t>
-            </w:r>
-            <w:r>
-              <w:t xml:space="preserve"> </w:t>
-            </w:r>
-            <w:r>
-              <w:rPr>
-                <w:rStyle w:val="VerbatimChar"/>
-              </w:rPr>
-              <w:t xml:space="preserve">:4000</w:t>
-            </w:r>
-          </w:p>
-        </w:tc>
-        <w:tc>
-          <w:tcPr/>
-          <w:p>
-            <w:pPr>
-              <w:pStyle w:val="Compact"/>
-            </w:pPr>
-            <w:r>
-              <w:t xml:space="preserve">The shipped</w:t>
-            </w:r>
-            <w:r>
-              <w:t xml:space="preserve"> </w:t>
-            </w:r>
-            <w:r>
-              <w:rPr>
-                <w:rStyle w:val="VerbatimChar"/>
-              </w:rPr>
-              <w:t xml:space="preserve">docker-compose.example.yaml</w:t>
-            </w:r>
-            <w:r>
-              <w:t xml:space="preserve"> </w:t>
-            </w:r>
-            <w:r>
-              <w:t xml:space="preserve">and</w:t>
-            </w:r>
-            <w:r>
-              <w:t xml:space="preserve"> </w:t>
-            </w:r>
-            <w:r>
-              <w:rPr>
-                <w:rStyle w:val="VerbatimChar"/>
-              </w:rPr>
-              <w:t xml:space="preserve">Dockerfile EXPOSE</w:t>
-            </w:r>
-            <w:r>
-              <w:t xml:space="preserve"> </w:t>
-            </w:r>
-            <w:r>
-              <w:t xml:space="preserve">use</w:t>
-            </w:r>
-            <w:r>
-              <w:t xml:space="preserve"> </w:t>
-            </w:r>
-            <w:r>
-              <w:rPr>
-                <w:b/>
-                <w:bCs/>
-              </w:rPr>
-              <w:t xml:space="preserve">8073</w:t>
-            </w:r>
-            <w:r>
-              <w:t xml:space="preserve">.</w:t>
-            </w:r>
-            <w:r>
-              <w:t xml:space="preserve"> </w:t>
-            </w:r>
-            <w:r>
-              <w:rPr>
-                <w:rStyle w:val="VerbatimChar"/>
-              </w:rPr>
-              <w:t xml:space="preserve">EXPOSE</w:t>
-            </w:r>
-            <w:r>
-              <w:t xml:space="preserve"> </w:t>
-            </w:r>
-            <w:r>
-              <w:t xml:space="preserve">is documentation only; the listening port is</w:t>
-            </w:r>
-            <w:r>
-              <w:t xml:space="preserve"> </w:t>
-            </w:r>
-            <w:r>
-              <w:rPr>
-                <w:rStyle w:val="VerbatimChar"/>
-              </w:rPr>
-              <w:t xml:space="preserve">PORT</w:t>
-            </w:r>
-            <w:r>
-              <w:t xml:space="preserve">, and the host mapping is whatever the compose file says</w:t>
+              <w:t xml:space="preserve">IMPLEMENTATION-PLAN.md</w:t>
+            </w:r>
+            <w:r>
+              <w:t xml:space="preserve"> </w:t>
+            </w:r>
+            <w:r>
+              <w:t xml:space="preserve">header says</w:t>
+            </w:r>
+            <w:r>
+              <w:t xml:space="preserve"> </w:t>
+            </w:r>
+            <w:r>
+              <w:t xml:space="preserve">“nothing proposed below is implemented yet”</w:t>
+            </w:r>
+          </w:p>
+        </w:tc>
+        <w:tc>
+          <w:tcPr/>
+          <w:p>
+            <w:pPr>
+              <w:pStyle w:val="Compact"/>
+            </w:pPr>
+            <w:r>
+              <w:t xml:space="preserve">Written before the work; the shipped code supersedes it</w:t>
             </w:r>
           </w:p>
         </w:tc>
@@ -6120,280 +6056,6 @@
               <w:rPr>
                 <w:rStyle w:val="VerbatimChar"/>
               </w:rPr>
-              <w:t xml:space="preserve">README.md</w:t>
-            </w:r>
-            <w:r>
-              <w:t xml:space="preserve"> </w:t>
-            </w:r>
-            <w:r>
-              <w:t xml:space="preserve">“Project structure”</w:t>
-            </w:r>
-            <w:r>
-              <w:t xml:space="preserve"> </w:t>
-            </w:r>
-            <w:r>
-              <w:t xml:space="preserve">lists</w:t>
-            </w:r>
-            <w:r>
-              <w:t xml:space="preserve"> </w:t>
-            </w:r>
-            <w:r>
-              <w:rPr>
-                <w:rStyle w:val="VerbatimChar"/>
-              </w:rPr>
-              <w:t xml:space="preserve">docker-compose.yml</w:t>
-            </w:r>
-          </w:p>
-        </w:tc>
-        <w:tc>
-          <w:tcPr/>
-          <w:p>
-            <w:pPr>
-              <w:pStyle w:val="Compact"/>
-            </w:pPr>
-            <w:r>
-              <w:t xml:space="preserve">The repository ships</w:t>
-            </w:r>
-            <w:r>
-              <w:t xml:space="preserve"> </w:t>
-            </w:r>
-            <w:r>
-              <w:rPr>
-                <w:rStyle w:val="VerbatimChar"/>
-              </w:rPr>
-              <w:t xml:space="preserve">docker-compose.example.yaml</w:t>
-            </w:r>
-            <w:r>
-              <w:t xml:space="preserve">; the real file is gitignored</w:t>
-            </w:r>
-          </w:p>
-        </w:tc>
-      </w:tr>
-      <w:tr>
-        <w:tc>
-          <w:tcPr/>
-          <w:p>
-            <w:pPr>
-              <w:pStyle w:val="Compact"/>
-            </w:pPr>
-            <w:r>
-              <w:rPr>
-                <w:rStyle w:val="VerbatimChar"/>
-              </w:rPr>
-              <w:t xml:space="preserve">README.md</w:t>
-            </w:r>
-            <w:r>
-              <w:t xml:space="preserve"> </w:t>
-            </w:r>
-            <w:r>
-              <w:t xml:space="preserve">claims every migration is idempotent</w:t>
-            </w:r>
-          </w:p>
-        </w:tc>
-        <w:tc>
-          <w:tcPr/>
-          <w:p>
-            <w:pPr>
-              <w:pStyle w:val="Compact"/>
-            </w:pPr>
-            <w:r>
-              <w:t xml:space="preserve">True for most,</w:t>
-            </w:r>
-            <w:r>
-              <w:t xml:space="preserve"> </w:t>
-            </w:r>
-            <w:r>
-              <w:rPr>
-                <w:b/>
-                <w:bCs/>
-              </w:rPr>
-              <w:t xml:space="preserve">not</w:t>
-            </w:r>
-            <w:r>
-              <w:t xml:space="preserve"> </w:t>
-            </w:r>
-            <w:r>
-              <w:t xml:space="preserve">for</w:t>
-            </w:r>
-            <w:r>
-              <w:t xml:space="preserve"> </w:t>
-            </w:r>
-            <w:r>
-              <w:rPr>
-                <w:rStyle w:val="VerbatimChar"/>
-              </w:rPr>
-              <w:t xml:space="preserve">002</w:t>
-            </w:r>
-            <w:r>
-              <w:t xml:space="preserve">,</w:t>
-            </w:r>
-            <w:r>
-              <w:t xml:space="preserve"> </w:t>
-            </w:r>
-            <w:r>
-              <w:rPr>
-                <w:rStyle w:val="VerbatimChar"/>
-              </w:rPr>
-              <w:t xml:space="preserve">006</w:t>
-            </w:r>
-            <w:r>
-              <w:t xml:space="preserve"> </w:t>
-            </w:r>
-            <w:r>
-              <w:t xml:space="preserve">and</w:t>
-            </w:r>
-            <w:r>
-              <w:t xml:space="preserve"> </w:t>
-            </w:r>
-            <w:r>
-              <w:rPr>
-                <w:rStyle w:val="VerbatimChar"/>
-              </w:rPr>
-              <w:t xml:space="preserve">999</w:t>
-            </w:r>
-            <w:r>
-              <w:t xml:space="preserve">, which contain plain</w:t>
-            </w:r>
-            <w:r>
-              <w:t xml:space="preserve"> </w:t>
-            </w:r>
-            <w:r>
-              <w:rPr>
-                <w:rStyle w:val="VerbatimChar"/>
-              </w:rPr>
-              <w:t xml:space="preserve">ALTER</w:t>
-            </w:r>
-            <w:r>
-              <w:t xml:space="preserve"> </w:t>
-            </w:r>
-            <w:r>
-              <w:t xml:space="preserve">/</w:t>
-            </w:r>
-            <w:r>
-              <w:t xml:space="preserve"> </w:t>
-            </w:r>
-            <w:r>
-              <w:rPr>
-                <w:rStyle w:val="VerbatimChar"/>
-              </w:rPr>
-              <w:t xml:space="preserve">DROP INDEX</w:t>
-            </w:r>
-            <w:r>
-              <w:t xml:space="preserve"> </w:t>
-            </w:r>
-            <w:r>
-              <w:t xml:space="preserve">/</w:t>
-            </w:r>
-            <w:r>
-              <w:t xml:space="preserve"> </w:t>
-            </w:r>
-            <w:r>
-              <w:rPr>
-                <w:rStyle w:val="VerbatimChar"/>
-              </w:rPr>
-              <w:t xml:space="preserve">ADD CONSTRAINT</w:t>
-            </w:r>
-          </w:p>
-        </w:tc>
-      </w:tr>
-      <w:tr>
-        <w:tc>
-          <w:tcPr/>
-          <w:p>
-            <w:pPr>
-              <w:pStyle w:val="Compact"/>
-            </w:pPr>
-            <w:r>
-              <w:rPr>
-                <w:rStyle w:val="VerbatimChar"/>
-              </w:rPr>
-              <w:t xml:space="preserve">README.md</w:t>
-            </w:r>
-            <w:r>
-              <w:t xml:space="preserve"> </w:t>
-            </w:r>
-            <w:r>
-              <w:t xml:space="preserve">ends with a</w:t>
-            </w:r>
-            <w:r>
-              <w:t xml:space="preserve"> </w:t>
-            </w:r>
-            <w:r>
-              <w:rPr>
-                <w:rStyle w:val="VerbatimChar"/>
-              </w:rPr>
-              <w:t xml:space="preserve">docker build</w:t>
-            </w:r>
-            <w:r>
-              <w:t xml:space="preserve"> </w:t>
-            </w:r>
-            <w:r>
-              <w:t xml:space="preserve">line containing a real Turnstile site key</w:t>
-            </w:r>
-          </w:p>
-        </w:tc>
-        <w:tc>
-          <w:tcPr/>
-          <w:p>
-            <w:pPr>
-              <w:pStyle w:val="Compact"/>
-            </w:pPr>
-            <w:r>
-              <w:t xml:space="preserve">Site keys are public, but a committed key is still needless noise — keep build args in CI variables</w:t>
-            </w:r>
-          </w:p>
-        </w:tc>
-      </w:tr>
-      <w:tr>
-        <w:tc>
-          <w:tcPr/>
-          <w:p>
-            <w:pPr>
-              <w:pStyle w:val="Compact"/>
-            </w:pPr>
-            <w:r>
-              <w:rPr>
-                <w:rStyle w:val="VerbatimChar"/>
-              </w:rPr>
-              <w:t xml:space="preserve">IMPLEMENTATION-PLAN.md</w:t>
-            </w:r>
-            <w:r>
-              <w:t xml:space="preserve"> </w:t>
-            </w:r>
-            <w:r>
-              <w:t xml:space="preserve">header says</w:t>
-            </w:r>
-            <w:r>
-              <w:t xml:space="preserve"> </w:t>
-            </w:r>
-            <w:r>
-              <w:t xml:space="preserve">“nothing proposed below is implemented yet”</w:t>
-            </w:r>
-          </w:p>
-        </w:tc>
-        <w:tc>
-          <w:tcPr/>
-          <w:p>
-            <w:pPr>
-              <w:pStyle w:val="Compact"/>
-            </w:pPr>
-            <w:r>
-              <w:t xml:space="preserve">Written before the work; the shipped code supersedes it</w:t>
-            </w:r>
-          </w:p>
-        </w:tc>
-      </w:tr>
-      <w:tr>
-        <w:tc>
-          <w:tcPr/>
-          <w:p>
-            <w:pPr>
-              <w:pStyle w:val="Compact"/>
-            </w:pPr>
-            <w:r>
-              <w:rPr>
-                <w:rStyle w:val="VerbatimChar"/>
-              </w:rPr>
               <w:t xml:space="preserve">testing/helpers/global-setup.js</w:t>
             </w:r>
             <w:r>
@@ -6426,6 +6088,113 @@
         </w:tc>
       </w:tr>
     </w:tbl>
+    <w:p>
+      <w:pPr>
+        <w:pStyle w:val="BodyText"/>
+      </w:pPr>
+      <w:r>
+        <w:t xml:space="preserve">Three older discrepancies are now closed, so do not go looking for them: the</w:t>
+      </w:r>
+      <w:r>
+        <w:t xml:space="preserve"> </w:t>
+      </w:r>
+      <w:r>
+        <w:t xml:space="preserve">README uses the same</w:t>
+      </w:r>
+      <w:r>
+        <w:t xml:space="preserve"> </w:t>
+      </w:r>
+      <w:r>
+        <w:rPr>
+          <w:rStyle w:val="VerbatimChar"/>
+        </w:rPr>
+        <w:t xml:space="preserve">8073</w:t>
+      </w:r>
+      <w:r>
+        <w:t xml:space="preserve"> </w:t>
+      </w:r>
+      <w:r>
+        <w:t xml:space="preserve">port scheme as</w:t>
+      </w:r>
+      <w:r>
+        <w:t xml:space="preserve"> </w:t>
+      </w:r>
+      <w:r>
+        <w:rPr>
+          <w:rStyle w:val="VerbatimChar"/>
+        </w:rPr>
+        <w:t xml:space="preserve">Dockerfile</w:t>
+      </w:r>
+      <w:r>
+        <w:t xml:space="preserve"> </w:t>
+      </w:r>
+      <w:r>
+        <w:t xml:space="preserve">and</w:t>
+      </w:r>
+      <w:r>
+        <w:t xml:space="preserve"> </w:t>
+      </w:r>
+      <w:r>
+        <w:rPr>
+          <w:rStyle w:val="VerbatimChar"/>
+        </w:rPr>
+        <w:t xml:space="preserve">docker-compose.example.yaml</w:t>
+      </w:r>
+      <w:r>
+        <w:t xml:space="preserve">; it names the shipped example file instead of a</w:t>
+      </w:r>
+      <w:r>
+        <w:t xml:space="preserve"> </w:t>
+      </w:r>
+      <w:r>
+        <w:t xml:space="preserve">gitignored</w:t>
+      </w:r>
+      <w:r>
+        <w:t xml:space="preserve"> </w:t>
+      </w:r>
+      <w:r>
+        <w:rPr>
+          <w:rStyle w:val="VerbatimChar"/>
+        </w:rPr>
+        <w:t xml:space="preserve">docker-compose.yml</w:t>
+      </w:r>
+      <w:r>
+        <w:t xml:space="preserve">; its migration paragraph states which files are</w:t>
+      </w:r>
+      <w:r>
+        <w:t xml:space="preserve"> </w:t>
+      </w:r>
+      <w:r>
+        <w:t xml:space="preserve">idempotent and which rely on the</w:t>
+      </w:r>
+      <w:r>
+        <w:t xml:space="preserve"> </w:t>
+      </w:r>
+      <w:r>
+        <w:rPr>
+          <w:rStyle w:val="VerbatimChar"/>
+        </w:rPr>
+        <w:t xml:space="preserve">schema_migrations</w:t>
+      </w:r>
+      <w:r>
+        <w:t xml:space="preserve"> </w:t>
+      </w:r>
+      <w:r>
+        <w:t xml:space="preserve">tracking row. The real</w:t>
+      </w:r>
+      <w:r>
+        <w:t xml:space="preserve"> </w:t>
+      </w:r>
+      <w:r>
+        <w:t xml:space="preserve">Turnstile site key that used to sit at the end of the README is gone — build</w:t>
+      </w:r>
+      <w:r>
+        <w:t xml:space="preserve"> </w:t>
+      </w:r>
+      <w:r>
+        <w:t xml:space="preserve">args belong in CI variables.</w:t>
+      </w:r>
+    </w:p>
     <w:bookmarkEnd w:id="30"/>
     <w:sectPr>
       <w:footerReference r:id="rId9" w:type="default"/>

</xml_diff>